<commit_message>
fix catalog ffiltering errors and output format
</commit_message>
<xml_diff>
--- a/Doc/Catalog.docx
+++ b/Doc/Catalog.docx
@@ -209,8 +209,13 @@
           <w:bCs/>
         </w:rPr>
       </w:pPr>
-      <w:r>
-        <w:t xml:space="preserve">imageUrl: </w:t>
+      <w:proofErr w:type="spellStart"/>
+      <w:r>
+        <w:t>imageUrl</w:t>
+      </w:r>
+      <w:proofErr w:type="spellEnd"/>
+      <w:r>
+        <w:t xml:space="preserve">: </w:t>
       </w:r>
       <w:r>
         <w:t>http://localhost:5173/public/pictures/</w:t>
@@ -352,8 +357,13 @@
           <w:bCs/>
         </w:rPr>
       </w:pPr>
-      <w:r>
-        <w:t xml:space="preserve">imageUrl: </w:t>
+      <w:proofErr w:type="spellStart"/>
+      <w:r>
+        <w:t>imageUrl</w:t>
+      </w:r>
+      <w:proofErr w:type="spellEnd"/>
+      <w:r>
+        <w:t xml:space="preserve">: </w:t>
       </w:r>
       <w:r>
         <w:t>http://localhost:5173/public/pictures/volleyball.jpg</w:t>
@@ -517,8 +527,13 @@
           <w:bCs/>
         </w:rPr>
       </w:pPr>
-      <w:r>
-        <w:t xml:space="preserve">imageUrl: </w:t>
+      <w:proofErr w:type="spellStart"/>
+      <w:r>
+        <w:t>imageUrl</w:t>
+      </w:r>
+      <w:proofErr w:type="spellEnd"/>
+      <w:r>
+        <w:t xml:space="preserve">: </w:t>
       </w:r>
       <w:r>
         <w:t>http://localhost:5173/public/pictures/</w:t>
@@ -682,8 +697,13 @@
           <w:bCs/>
         </w:rPr>
       </w:pPr>
-      <w:r>
-        <w:t xml:space="preserve">imageUrl: </w:t>
+      <w:proofErr w:type="spellStart"/>
+      <w:r>
+        <w:t>imageUrl</w:t>
+      </w:r>
+      <w:proofErr w:type="spellEnd"/>
+      <w:r>
+        <w:t xml:space="preserve">: </w:t>
       </w:r>
       <w:r>
         <w:t>http://localhost:5173/public/pictures/</w:t>
@@ -827,17 +847,19 @@
           <w:bCs/>
         </w:rPr>
       </w:pPr>
-      <w:r>
-        <w:t xml:space="preserve">imageUrl: </w:t>
+      <w:proofErr w:type="spellStart"/>
+      <w:r>
+        <w:t>imageUrl</w:t>
+      </w:r>
+      <w:proofErr w:type="spellEnd"/>
+      <w:r>
+        <w:t xml:space="preserve">: </w:t>
       </w:r>
       <w:r>
         <w:t>http://localhost:5173/public/pictures/</w:t>
       </w:r>
       <w:r>
-        <w:t>teather</w:t>
-      </w:r>
-      <w:r>
-        <w:t>.png</w:t>
+        <w:t>teather.png</w:t>
       </w:r>
     </w:p>
     <w:p>
@@ -982,20 +1004,19 @@
           <w:bCs/>
         </w:rPr>
       </w:pPr>
-      <w:r>
-        <w:t xml:space="preserve">imageUrl: </w:t>
+      <w:proofErr w:type="spellStart"/>
+      <w:r>
+        <w:t>imageUrl</w:t>
+      </w:r>
+      <w:proofErr w:type="spellEnd"/>
+      <w:r>
+        <w:t xml:space="preserve">: </w:t>
       </w:r>
       <w:r>
         <w:t>http://localhost:5173/public/pictures/</w:t>
       </w:r>
       <w:r>
-        <w:t>p</w:t>
-      </w:r>
-      <w:r>
-        <w:t>hoto</w:t>
-      </w:r>
-      <w:r>
-        <w:t>.png</w:t>
+        <w:t>photo.png</w:t>
       </w:r>
     </w:p>
     <w:p>
@@ -1017,21 +1038,33 @@
         <w:t>Category:</w:t>
       </w:r>
       <w:r>
-        <w:t xml:space="preserve"> Arts </w:t>
-      </w:r>
-      <w:r>
-        <w:rPr>
-          <w:b/>
-          <w:bCs/>
-        </w:rPr>
         <w:t xml:space="preserve"> </w:t>
       </w:r>
-      <w:r>
-        <w:rPr>
-          <w:b/>
-          <w:bCs/>
-        </w:rPr>
-        <w:t>Description:</w:t>
+      <w:proofErr w:type="gramStart"/>
+      <w:r>
+        <w:t xml:space="preserve">Arts </w:t>
+      </w:r>
+      <w:r>
+        <w:rPr>
+          <w:b/>
+          <w:bCs/>
+        </w:rPr>
+        <w:t xml:space="preserve"> </w:t>
+      </w:r>
+      <w:r>
+        <w:rPr>
+          <w:b/>
+          <w:bCs/>
+        </w:rPr>
+        <w:t>Description</w:t>
+      </w:r>
+      <w:proofErr w:type="gramEnd"/>
+      <w:r>
+        <w:rPr>
+          <w:b/>
+          <w:bCs/>
+        </w:rPr>
+        <w:t>:</w:t>
       </w:r>
       <w:r>
         <w:t xml:space="preserve"> Students learn composition, lighting, and camera settings while exploring creative storytelling through photography. Each session includes hands</w:t>
@@ -1115,6 +1148,7 @@
       </w:pPr>
     </w:p>
     <w:p>
+      <w:proofErr w:type="gramStart"/>
       <w:r>
         <w:rPr>
           <w:b/>
@@ -1130,7 +1164,11 @@
         <w:t xml:space="preserve"> </w:t>
       </w:r>
       <w:r>
-        <w:t>(id=</w:t>
+        <w:t>(</w:t>
+      </w:r>
+      <w:proofErr w:type="gramEnd"/>
+      <w:r>
+        <w:t>id=</w:t>
       </w:r>
       <w:r>
         <w:t>34</w:t>
@@ -1146,17 +1184,19 @@
           <w:bCs/>
         </w:rPr>
       </w:pPr>
-      <w:r>
-        <w:t xml:space="preserve">imageUrl: </w:t>
+      <w:proofErr w:type="spellStart"/>
+      <w:r>
+        <w:t>imageUrl</w:t>
+      </w:r>
+      <w:proofErr w:type="spellEnd"/>
+      <w:r>
+        <w:t xml:space="preserve">: </w:t>
       </w:r>
       <w:r>
         <w:t>http://localhost:5173/public/pictures/</w:t>
       </w:r>
       <w:r>
-        <w:t>dance</w:t>
-      </w:r>
-      <w:r>
-        <w:t>.png</w:t>
+        <w:t>dance.png</w:t>
       </w:r>
     </w:p>
     <w:p>
@@ -1325,7 +1365,7 @@
           <w:noProof/>
         </w:rPr>
         <w:drawing>
-          <wp:anchor distT="0" distB="0" distL="114300" distR="114300" simplePos="0" relativeHeight="251667456" behindDoc="1" locked="0" layoutInCell="1" allowOverlap="1" wp14:anchorId="5704B2A4" wp14:editId="1EC35A13">
+          <wp:anchor distT="0" distB="0" distL="114300" distR="114300" simplePos="0" relativeHeight="251667456" behindDoc="1" locked="0" layoutInCell="1" allowOverlap="1" wp14:anchorId="5704B2A4" wp14:editId="65689DEB">
             <wp:simplePos x="0" y="0"/>
             <wp:positionH relativeFrom="column">
               <wp:posOffset>4076700</wp:posOffset>
@@ -1469,7 +1509,15 @@
         <w:t>September 14</w:t>
       </w:r>
       <w:r>
-        <w:t xml:space="preserve">, meeting every </w:t>
+        <w:t xml:space="preserve">, </w:t>
+      </w:r>
+      <w:proofErr w:type="gramStart"/>
+      <w:r>
+        <w:t>meeting</w:t>
+      </w:r>
+      <w:proofErr w:type="gramEnd"/>
+      <w:r>
+        <w:t xml:space="preserve"> every </w:t>
       </w:r>
       <w:r>
         <w:rPr>
@@ -2774,7 +2822,11 @@
         <w:t>Category:</w:t>
       </w:r>
       <w:r>
-        <w:t xml:space="preserve"> Life Skills </w:t>
+        <w:t xml:space="preserve"> Life </w:t>
+      </w:r>
+      <w:proofErr w:type="gramStart"/>
+      <w:r>
+        <w:t xml:space="preserve">Skills </w:t>
       </w:r>
       <w:r>
         <w:rPr>
@@ -2788,7 +2840,15 @@
           <w:b/>
           <w:bCs/>
         </w:rPr>
-        <w:t>Description:</w:t>
+        <w:t>Description</w:t>
+      </w:r>
+      <w:proofErr w:type="gramEnd"/>
+      <w:r>
+        <w:rPr>
+          <w:b/>
+          <w:bCs/>
+        </w:rPr>
+        <w:t>:</w:t>
       </w:r>
       <w:r>
         <w:t xml:space="preserve"> Students learn how to plant, care for, and harvest vegetables and herbs while exploring sustainability and ecology. The activity promotes responsibility and environmental awareness.</w:t>
@@ -3063,6 +3123,22 @@
           <w:bCs/>
         </w:rPr>
         <w:t>Yoga &amp; Mindfulness</w:t>
+      </w:r>
+      <w:r>
+        <w:rPr>
+          <w:b/>
+          <w:bCs/>
+        </w:rPr>
+        <w:t xml:space="preserve"> </w:t>
+      </w:r>
+      <w:r>
+        <w:t>(id</w:t>
+      </w:r>
+      <w:r>
+        <w:t>=91</w:t>
+      </w:r>
+      <w:r>
+        <w:t>)</w:t>
       </w:r>
     </w:p>
     <w:p>

</xml_diff>